<commit_message>
Add .gitignore (don't want pptx and student models in repo) Added UML-Cours7.pdf Addded tp5 (profiles)
Signed-off-by: Ansgar Radermacher <ansgar.radermacher@cea.fr>
</commit_message>
<xml_diff>
--- a/Tutos/tp4/Activitiy_Tutorial.docx
+++ b/Tutos/tp4/Activitiy_Tutorial.docx
@@ -1,6 +1,6 @@
 
 <file path=word/document.xml><?xml version="1.0" encoding="utf-8"?>
-<w:document xmlns:wpc="http://schemas.microsoft.com/office/word/2010/wordprocessingCanvas" xmlns:mc="http://schemas.openxmlformats.org/markup-compatibility/2006" xmlns:o="urn:schemas-microsoft-com:office:office" xmlns:r="http://schemas.openxmlformats.org/officeDocument/2006/relationships" xmlns:m="http://schemas.openxmlformats.org/officeDocument/2006/math" xmlns:v="urn:schemas-microsoft-com:vml" xmlns:wp14="http://schemas.microsoft.com/office/word/2010/wordprocessingDrawing" xmlns:wp="http://schemas.openxmlformats.org/drawingml/2006/wordprocessingDrawing" xmlns:w10="urn:schemas-microsoft-com:office:word" xmlns:w="http://schemas.openxmlformats.org/wordprocessingml/2006/main" xmlns:w14="http://schemas.microsoft.com/office/word/2010/wordml" xmlns:w15="http://schemas.microsoft.com/office/word/2012/wordml" xmlns:wpg="http://schemas.microsoft.com/office/word/2010/wordprocessingGroup" xmlns:wpi="http://schemas.microsoft.com/office/word/2010/wordprocessingInk" xmlns:wne="http://schemas.microsoft.com/office/word/2006/wordml" xmlns:wps="http://schemas.microsoft.com/office/word/2010/wordprocessingShape" mc:Ignorable="w14 w15 wp14">
+<w:document xmlns:wpc="http://schemas.microsoft.com/office/word/2010/wordprocessingCanvas" xmlns:cx="http://schemas.microsoft.com/office/drawing/2014/chartex" xmlns:cx1="http://schemas.microsoft.com/office/drawing/2015/9/8/chartex" xmlns:mc="http://schemas.openxmlformats.org/markup-compatibility/2006" xmlns:o="urn:schemas-microsoft-com:office:office" xmlns:r="http://schemas.openxmlformats.org/officeDocument/2006/relationships" xmlns:m="http://schemas.openxmlformats.org/officeDocument/2006/math" xmlns:v="urn:schemas-microsoft-com:vml" xmlns:wp14="http://schemas.microsoft.com/office/word/2010/wordprocessingDrawing" xmlns:wp="http://schemas.openxmlformats.org/drawingml/2006/wordprocessingDrawing" xmlns:w10="urn:schemas-microsoft-com:office:word" xmlns:w="http://schemas.openxmlformats.org/wordprocessingml/2006/main" xmlns:w14="http://schemas.microsoft.com/office/word/2010/wordml" xmlns:w15="http://schemas.microsoft.com/office/word/2012/wordml" xmlns:w16se="http://schemas.microsoft.com/office/word/2015/wordml/symex" xmlns:wpg="http://schemas.microsoft.com/office/word/2010/wordprocessingGroup" xmlns:wpi="http://schemas.microsoft.com/office/word/2010/wordprocessingInk" xmlns:wne="http://schemas.microsoft.com/office/word/2006/wordml" xmlns:wps="http://schemas.microsoft.com/office/word/2010/wordprocessingShape" mc:Ignorable="w14 w15 w16se wp14">
   <w:body>
     <w:p>
       <w:pPr>
@@ -80,7 +80,43 @@
           <w:sz w:val="24"/>
           <w:szCs w:val="24"/>
         </w:rPr>
-        <w:t>Jérémie Tatibouët, Shuai Li, Patrick Tessier and François Terrier</w:t>
+        <w:t xml:space="preserve">Jérémie </w:t>
+      </w:r>
+      <w:proofErr w:type="spellStart"/>
+      <w:r>
+        <w:rPr>
+          <w:rFonts w:ascii="Consolas" w:hAnsi="Consolas" w:cs="Consolas"/>
+          <w:sz w:val="24"/>
+          <w:szCs w:val="24"/>
+        </w:rPr>
+        <w:t>Tatibouët</w:t>
+      </w:r>
+      <w:proofErr w:type="spellEnd"/>
+      <w:r>
+        <w:rPr>
+          <w:rFonts w:ascii="Consolas" w:hAnsi="Consolas" w:cs="Consolas"/>
+          <w:sz w:val="24"/>
+          <w:szCs w:val="24"/>
+        </w:rPr>
+        <w:t xml:space="preserve">, </w:t>
+      </w:r>
+      <w:proofErr w:type="spellStart"/>
+      <w:r>
+        <w:rPr>
+          <w:rFonts w:ascii="Consolas" w:hAnsi="Consolas" w:cs="Consolas"/>
+          <w:sz w:val="24"/>
+          <w:szCs w:val="24"/>
+        </w:rPr>
+        <w:t>Shuai</w:t>
+      </w:r>
+      <w:proofErr w:type="spellEnd"/>
+      <w:r>
+        <w:rPr>
+          <w:rFonts w:ascii="Consolas" w:hAnsi="Consolas" w:cs="Consolas"/>
+          <w:sz w:val="24"/>
+          <w:szCs w:val="24"/>
+        </w:rPr>
+        <w:t xml:space="preserve"> Li, Patrick Tessier and François Terrier</w:t>
       </w:r>
     </w:p>
     <w:p>
@@ -98,7 +134,43 @@
           <w:sz w:val="24"/>
           <w:szCs w:val="24"/>
         </w:rPr>
-        <w:t>{first-name}.{last-name}@cea.fr</w:t>
+        <w:t>{first-</w:t>
+      </w:r>
+      <w:proofErr w:type="spellStart"/>
+      <w:r>
+        <w:rPr>
+          <w:rFonts w:ascii="Consolas" w:hAnsi="Consolas" w:cs="Consolas"/>
+          <w:sz w:val="24"/>
+          <w:szCs w:val="24"/>
+        </w:rPr>
+        <w:t>name</w:t>
+      </w:r>
+      <w:proofErr w:type="spellEnd"/>
+      <w:r>
+        <w:rPr>
+          <w:rFonts w:ascii="Consolas" w:hAnsi="Consolas" w:cs="Consolas"/>
+          <w:sz w:val="24"/>
+          <w:szCs w:val="24"/>
+        </w:rPr>
+        <w:t>}.{last-</w:t>
+      </w:r>
+      <w:proofErr w:type="spellStart"/>
+      <w:r>
+        <w:rPr>
+          <w:rFonts w:ascii="Consolas" w:hAnsi="Consolas" w:cs="Consolas"/>
+          <w:sz w:val="24"/>
+          <w:szCs w:val="24"/>
+        </w:rPr>
+        <w:t>name</w:t>
+      </w:r>
+      <w:proofErr w:type="spellEnd"/>
+      <w:r>
+        <w:rPr>
+          <w:rFonts w:ascii="Consolas" w:hAnsi="Consolas" w:cs="Consolas"/>
+          <w:sz w:val="24"/>
+          <w:szCs w:val="24"/>
+        </w:rPr>
+        <w:t>}@cea.fr</w:t>
       </w:r>
     </w:p>
     <w:p>
@@ -425,7 +497,7 @@
           <w:szCs w:val="24"/>
           <w:lang w:val="en-US"/>
         </w:rPr>
-        <w:t>Lab1-QuickStart.zip</w:t>
+        <w:t>Lab1-QuickStart</w:t>
       </w:r>
       <w:r>
         <w:rPr>
@@ -657,6 +729,7 @@
         </w:rPr>
         <w:t>ssociate the activity “</w:t>
       </w:r>
+      <w:proofErr w:type="spellStart"/>
       <w:r>
         <w:rPr>
           <w:rFonts w:ascii="Consolas" w:hAnsi="Consolas" w:cs="Consolas"/>
@@ -666,6 +739,7 @@
         </w:rPr>
         <w:t>distanceImpl</w:t>
       </w:r>
+      <w:proofErr w:type="spellEnd"/>
       <w:r>
         <w:rPr>
           <w:rFonts w:ascii="Consolas" w:hAnsi="Consolas" w:cs="Consolas"/>
@@ -1159,6 +1233,7 @@
         </w:rPr>
         <w:t>“</w:t>
       </w:r>
+      <w:proofErr w:type="spellStart"/>
       <w:r>
         <w:rPr>
           <w:rFonts w:ascii="Consolas" w:hAnsi="Consolas" w:cs="Consolas"/>
@@ -1177,6 +1252,7 @@
         </w:rPr>
         <w:t>root</w:t>
       </w:r>
+      <w:proofErr w:type="spellEnd"/>
       <w:r>
         <w:rPr>
           <w:rFonts w:ascii="Consolas" w:hAnsi="Consolas" w:cs="Consolas"/>
@@ -1194,6 +1270,7 @@
         </w:rPr>
         <w:t>. Such functions are available in the library “</w:t>
       </w:r>
+      <w:proofErr w:type="spellStart"/>
       <w:r>
         <w:rPr>
           <w:rFonts w:ascii="Consolas" w:hAnsi="Consolas" w:cs="Consolas"/>
@@ -1203,6 +1280,7 @@
         </w:rPr>
         <w:t>MathsLib</w:t>
       </w:r>
+      <w:proofErr w:type="spellEnd"/>
       <w:r>
         <w:rPr>
           <w:rFonts w:ascii="Consolas" w:hAnsi="Consolas" w:cs="Consolas"/>
@@ -1561,8 +1639,10 @@
           <w:szCs w:val="24"/>
           <w:lang w:val="en-US"/>
         </w:rPr>
-        <w:t>Lab2-AsynchronousCommunications.zip</w:t>
-      </w:r>
+        <w:t>Lab2-AsynchronousCommunications</w:t>
+      </w:r>
+      <w:bookmarkStart w:id="0" w:name="_GoBack"/>
+      <w:bookmarkEnd w:id="0"/>
       <w:r>
         <w:rPr>
           <w:rFonts w:ascii="Consolas" w:hAnsi="Consolas" w:cs="Consolas"/>
@@ -1877,13 +1957,23 @@
         </w:rPr>
         <w:t xml:space="preserve"> communications </w:t>
       </w:r>
-      <w:r>
-        <w:rPr>
-          <w:rFonts w:ascii="Consolas" w:hAnsi="Consolas" w:cs="Consolas"/>
-          <w:szCs w:val="24"/>
-          <w:lang w:val="en-US"/>
-        </w:rPr>
-        <w:t>are materialized by signals</w:t>
+      <w:proofErr w:type="gramStart"/>
+      <w:r>
+        <w:rPr>
+          <w:rFonts w:ascii="Consolas" w:hAnsi="Consolas" w:cs="Consolas"/>
+          <w:szCs w:val="24"/>
+          <w:lang w:val="en-US"/>
+        </w:rPr>
+        <w:t>are materialized</w:t>
+      </w:r>
+      <w:proofErr w:type="gramEnd"/>
+      <w:r>
+        <w:rPr>
+          <w:rFonts w:ascii="Consolas" w:hAnsi="Consolas" w:cs="Consolas"/>
+          <w:szCs w:val="24"/>
+          <w:lang w:val="en-US"/>
+        </w:rPr>
+        <w:t xml:space="preserve"> by signals</w:t>
       </w:r>
       <w:r>
         <w:rPr>
@@ -2051,8 +2141,18 @@
           <w:szCs w:val="24"/>
           <w:lang w:val="en-US"/>
         </w:rPr>
-        <w:t>” signal occurrence is sent</w:t>
-      </w:r>
+        <w:t xml:space="preserve">” signal occurrence </w:t>
+      </w:r>
+      <w:proofErr w:type="gramStart"/>
+      <w:r>
+        <w:rPr>
+          <w:rFonts w:ascii="Consolas" w:hAnsi="Consolas" w:cs="Consolas"/>
+          <w:szCs w:val="24"/>
+          <w:lang w:val="en-US"/>
+        </w:rPr>
+        <w:t>is sent</w:t>
+      </w:r>
+      <w:proofErr w:type="gramEnd"/>
       <w:r>
         <w:rPr>
           <w:rFonts w:ascii="Consolas" w:hAnsi="Consolas" w:cs="Consolas"/>
@@ -2086,6 +2186,7 @@
         </w:rPr>
         <w:t>” waits until it receives an “</w:t>
       </w:r>
+      <w:proofErr w:type="spellStart"/>
       <w:r>
         <w:rPr>
           <w:rFonts w:ascii="Consolas" w:hAnsi="Consolas" w:cs="Consolas"/>
@@ -2095,6 +2196,7 @@
         </w:rPr>
         <w:t>Ack</w:t>
       </w:r>
+      <w:proofErr w:type="spellEnd"/>
       <w:r>
         <w:rPr>
           <w:rFonts w:ascii="Consolas" w:hAnsi="Consolas" w:cs="Consolas"/>
@@ -2238,8 +2340,27 @@
           <w:szCs w:val="24"/>
           <w:lang w:val="en-US"/>
         </w:rPr>
-        <w:t xml:space="preserve"> As soon as this sequence of action is realized it sends an “</w:t>
-      </w:r>
+        <w:t xml:space="preserve"> As soon as this sequence of action is </w:t>
+      </w:r>
+      <w:proofErr w:type="gramStart"/>
+      <w:r>
+        <w:rPr>
+          <w:rFonts w:ascii="Consolas" w:hAnsi="Consolas" w:cs="Consolas"/>
+          <w:szCs w:val="24"/>
+          <w:lang w:val="en-US"/>
+        </w:rPr>
+        <w:t>realized</w:t>
+      </w:r>
+      <w:proofErr w:type="gramEnd"/>
+      <w:r>
+        <w:rPr>
+          <w:rFonts w:ascii="Consolas" w:hAnsi="Consolas" w:cs="Consolas"/>
+          <w:szCs w:val="24"/>
+          <w:lang w:val="en-US"/>
+        </w:rPr>
+        <w:t xml:space="preserve"> it sends an “</w:t>
+      </w:r>
+      <w:proofErr w:type="spellStart"/>
       <w:r>
         <w:rPr>
           <w:rFonts w:ascii="Consolas" w:hAnsi="Consolas" w:cs="Consolas"/>
@@ -2249,6 +2370,7 @@
         </w:rPr>
         <w:t>Ack</w:t>
       </w:r>
+      <w:proofErr w:type="spellEnd"/>
       <w:r>
         <w:rPr>
           <w:rFonts w:ascii="Consolas" w:hAnsi="Consolas" w:cs="Consolas"/>
@@ -2564,7 +2686,25 @@
           <w:szCs w:val="24"/>
           <w:lang w:val="en-US"/>
         </w:rPr>
-        <w:t>using Moka (model execution framework of Papyrus).</w:t>
+        <w:t xml:space="preserve">using </w:t>
+      </w:r>
+      <w:proofErr w:type="spellStart"/>
+      <w:r>
+        <w:rPr>
+          <w:rFonts w:ascii="Consolas" w:hAnsi="Consolas" w:cs="Consolas"/>
+          <w:szCs w:val="24"/>
+          <w:lang w:val="en-US"/>
+        </w:rPr>
+        <w:t>Moka</w:t>
+      </w:r>
+      <w:proofErr w:type="spellEnd"/>
+      <w:r>
+        <w:rPr>
+          <w:rFonts w:ascii="Consolas" w:hAnsi="Consolas" w:cs="Consolas"/>
+          <w:szCs w:val="24"/>
+          <w:lang w:val="en-US"/>
+        </w:rPr>
+        <w:t xml:space="preserve"> (model execution framework of Papyrus).</w:t>
       </w:r>
       <w:r>
         <w:rPr>
@@ -2614,8 +2754,18 @@
           <w:szCs w:val="24"/>
           <w:lang w:val="en-US"/>
         </w:rPr>
-        <w:t>: Instead of an infinite execution</w:t>
-      </w:r>
+        <w:t xml:space="preserve">: Instead of an infinite </w:t>
+      </w:r>
+      <w:proofErr w:type="gramStart"/>
+      <w:r>
+        <w:rPr>
+          <w:rFonts w:ascii="Consolas" w:hAnsi="Consolas" w:cs="Consolas"/>
+          <w:szCs w:val="24"/>
+          <w:lang w:val="en-US"/>
+        </w:rPr>
+        <w:t>execution</w:t>
+      </w:r>
+      <w:proofErr w:type="gramEnd"/>
       <w:r>
         <w:rPr>
           <w:rFonts w:ascii="Consolas" w:hAnsi="Consolas" w:cs="Consolas"/>
@@ -2762,7 +2912,19 @@
                 <w:szCs w:val="24"/>
                 <w:lang w:val="en-US"/>
               </w:rPr>
-              <w:t>you knowledge</w:t>
+              <w:t xml:space="preserve">you </w:t>
+            </w:r>
+            <w:proofErr w:type="spellStart"/>
+            <w:r>
+              <w:rPr>
+                <w:rFonts w:ascii="Consolas" w:hAnsi="Consolas" w:cs="Consolas"/>
+                <w:b/>
+                <w:color w:val="FFFFFF" w:themeColor="background1"/>
+                <w:sz w:val="24"/>
+                <w:szCs w:val="24"/>
+                <w:lang w:val="en-US"/>
+              </w:rPr>
+              <w:t>knowledge</w:t>
             </w:r>
             <w:r>
               <w:rPr>
@@ -2775,6 +2937,7 @@
               </w:rPr>
               <w:t>s</w:t>
             </w:r>
+            <w:proofErr w:type="spellEnd"/>
             <w:r>
               <w:rPr>
                 <w:rFonts w:ascii="Consolas" w:hAnsi="Consolas" w:cs="Consolas"/>
@@ -3055,6 +3218,7 @@
         </w:rPr>
         <w:t>hen the “</w:t>
       </w:r>
+      <w:proofErr w:type="spellStart"/>
       <w:r>
         <w:rPr>
           <w:rFonts w:ascii="Consolas" w:hAnsi="Consolas" w:cs="Consolas"/>
@@ -3064,6 +3228,7 @@
         </w:rPr>
         <w:t>RequestProcessor</w:t>
       </w:r>
+      <w:proofErr w:type="spellEnd"/>
       <w:r>
         <w:rPr>
           <w:rFonts w:ascii="Consolas" w:hAnsi="Consolas" w:cs="Consolas"/>
@@ -3102,8 +3267,27 @@
           <w:szCs w:val="24"/>
           <w:lang w:val="en-US"/>
         </w:rPr>
-        <w:t xml:space="preserve"> it notifies the part of the system named “</w:t>
-      </w:r>
+        <w:t xml:space="preserve"> it </w:t>
+      </w:r>
+      <w:proofErr w:type="gramStart"/>
+      <w:r>
+        <w:rPr>
+          <w:rFonts w:ascii="Consolas" w:hAnsi="Consolas" w:cs="Consolas"/>
+          <w:szCs w:val="24"/>
+          <w:lang w:val="en-US"/>
+        </w:rPr>
+        <w:t>notifies</w:t>
+      </w:r>
+      <w:proofErr w:type="gramEnd"/>
+      <w:r>
+        <w:rPr>
+          <w:rFonts w:ascii="Consolas" w:hAnsi="Consolas" w:cs="Consolas"/>
+          <w:szCs w:val="24"/>
+          <w:lang w:val="en-US"/>
+        </w:rPr>
+        <w:t xml:space="preserve"> the part of the system named “</w:t>
+      </w:r>
+      <w:proofErr w:type="spellStart"/>
       <w:r>
         <w:rPr>
           <w:rFonts w:ascii="Consolas" w:hAnsi="Consolas" w:cs="Consolas"/>
@@ -3113,6 +3297,7 @@
         </w:rPr>
         <w:t>MotorControl</w:t>
       </w:r>
+      <w:proofErr w:type="spellEnd"/>
       <w:r>
         <w:rPr>
           <w:rFonts w:ascii="Consolas" w:hAnsi="Consolas" w:cs="Consolas"/>
@@ -3177,6 +3362,7 @@
         </w:rPr>
         <w:t>“</w:t>
       </w:r>
+      <w:proofErr w:type="spellStart"/>
       <w:r>
         <w:rPr>
           <w:rFonts w:ascii="Consolas" w:hAnsi="Consolas" w:cs="Consolas"/>
@@ -3186,6 +3372,7 @@
         </w:rPr>
         <w:t>pIM</w:t>
       </w:r>
+      <w:proofErr w:type="spellEnd"/>
       <w:r>
         <w:rPr>
           <w:rFonts w:ascii="Consolas" w:hAnsi="Consolas" w:cs="Consolas"/>
@@ -3202,6 +3389,7 @@
         </w:rPr>
         <w:t xml:space="preserve"> When the notification </w:t>
       </w:r>
+      <w:proofErr w:type="gramStart"/>
       <w:r>
         <w:rPr>
           <w:rFonts w:ascii="Consolas" w:hAnsi="Consolas" w:cs="Consolas"/>
@@ -3210,6 +3398,7 @@
         </w:rPr>
         <w:t>gets</w:t>
       </w:r>
+      <w:proofErr w:type="gramEnd"/>
       <w:r>
         <w:rPr>
           <w:rFonts w:ascii="Consolas" w:hAnsi="Consolas" w:cs="Consolas"/>
@@ -3226,6 +3415,7 @@
         </w:rPr>
         <w:t>by “</w:t>
       </w:r>
+      <w:proofErr w:type="spellStart"/>
       <w:r>
         <w:rPr>
           <w:rFonts w:ascii="Consolas" w:hAnsi="Consolas" w:cs="Consolas"/>
@@ -3235,6 +3425,7 @@
         </w:rPr>
         <w:t>MotorControl</w:t>
       </w:r>
+      <w:proofErr w:type="spellEnd"/>
       <w:r>
         <w:rPr>
           <w:rFonts w:ascii="Consolas" w:hAnsi="Consolas" w:cs="Consolas"/>
@@ -3251,6 +3442,7 @@
         </w:rPr>
         <w:t xml:space="preserve"> it makes the state of this part of the system to move from “</w:t>
       </w:r>
+      <w:proofErr w:type="spellStart"/>
       <w:r>
         <w:rPr>
           <w:rFonts w:ascii="Consolas" w:hAnsi="Consolas" w:cs="Consolas"/>
@@ -3260,6 +3452,7 @@
         </w:rPr>
         <w:t>ElevatorCarStopped</w:t>
       </w:r>
+      <w:proofErr w:type="spellEnd"/>
       <w:r>
         <w:rPr>
           <w:rFonts w:ascii="Consolas" w:hAnsi="Consolas" w:cs="Consolas"/>
@@ -3268,6 +3461,7 @@
         </w:rPr>
         <w:t>” to “</w:t>
       </w:r>
+      <w:proofErr w:type="spellStart"/>
       <w:r>
         <w:rPr>
           <w:rFonts w:ascii="Consolas" w:hAnsi="Consolas" w:cs="Consolas"/>
@@ -3277,6 +3471,7 @@
         </w:rPr>
         <w:t>ElevatorCarMoving</w:t>
       </w:r>
+      <w:proofErr w:type="spellEnd"/>
       <w:r>
         <w:rPr>
           <w:rFonts w:ascii="Consolas" w:hAnsi="Consolas" w:cs="Consolas"/>
@@ -3309,6 +3504,7 @@
         </w:rPr>
         <w:t>transmit the movement order to the real motor (the one that physically exists), the “</w:t>
       </w:r>
+      <w:proofErr w:type="spellStart"/>
       <w:r>
         <w:rPr>
           <w:rFonts w:ascii="Consolas" w:hAnsi="Consolas" w:cs="Consolas"/>
@@ -3318,6 +3514,7 @@
         </w:rPr>
         <w:t>MotorControl</w:t>
       </w:r>
+      <w:proofErr w:type="spellEnd"/>
       <w:r>
         <w:rPr>
           <w:rFonts w:ascii="Consolas" w:hAnsi="Consolas" w:cs="Consolas"/>
@@ -3334,6 +3531,7 @@
         </w:rPr>
         <w:t>from its “</w:t>
       </w:r>
+      <w:proofErr w:type="spellStart"/>
       <w:r>
         <w:rPr>
           <w:rFonts w:ascii="Consolas" w:hAnsi="Consolas" w:cs="Consolas"/>
@@ -3343,6 +3541,7 @@
         </w:rPr>
         <w:t>pE</w:t>
       </w:r>
+      <w:proofErr w:type="spellEnd"/>
       <w:r>
         <w:rPr>
           <w:rFonts w:ascii="Consolas" w:hAnsi="Consolas" w:cs="Consolas"/>
@@ -3432,6 +3631,7 @@
         </w:rPr>
         <w:t>“</w:t>
       </w:r>
+      <w:proofErr w:type="spellStart"/>
       <w:r>
         <w:rPr>
           <w:rFonts w:ascii="Consolas" w:hAnsi="Consolas" w:cs="Consolas"/>
@@ -3441,6 +3641,7 @@
         </w:rPr>
         <w:t>RequestProcessor</w:t>
       </w:r>
+      <w:proofErr w:type="spellEnd"/>
       <w:r>
         <w:rPr>
           <w:rFonts w:ascii="Consolas" w:hAnsi="Consolas" w:cs="Consolas"/>
@@ -3449,6 +3650,7 @@
         </w:rPr>
         <w:t>” interacts with the “</w:t>
       </w:r>
+      <w:proofErr w:type="spellStart"/>
       <w:r>
         <w:rPr>
           <w:rFonts w:ascii="Consolas" w:hAnsi="Consolas" w:cs="Consolas"/>
@@ -3458,6 +3660,7 @@
         </w:rPr>
         <w:t>MotorControl</w:t>
       </w:r>
+      <w:proofErr w:type="spellEnd"/>
       <w:r>
         <w:rPr>
           <w:rFonts w:ascii="Consolas" w:hAnsi="Consolas" w:cs="Consolas"/>
@@ -3593,6 +3796,7 @@
         </w:rPr>
         <w:t>through the port “</w:t>
       </w:r>
+      <w:proofErr w:type="spellStart"/>
       <w:r>
         <w:rPr>
           <w:rFonts w:ascii="Consolas" w:hAnsi="Consolas" w:cs="Consolas"/>
@@ -3602,6 +3806,7 @@
         </w:rPr>
         <w:t>pIM</w:t>
       </w:r>
+      <w:proofErr w:type="spellEnd"/>
       <w:r>
         <w:rPr>
           <w:rFonts w:ascii="Consolas" w:hAnsi="Consolas" w:cs="Consolas"/>
@@ -3691,6 +3896,7 @@
         </w:rPr>
         <w:t xml:space="preserve"> “</w:t>
       </w:r>
+      <w:proofErr w:type="spellStart"/>
       <w:r>
         <w:rPr>
           <w:rFonts w:ascii="Consolas" w:hAnsi="Consolas" w:cs="Consolas"/>
@@ -3700,6 +3906,7 @@
         </w:rPr>
         <w:t>ElevatorCarStopped</w:t>
       </w:r>
+      <w:proofErr w:type="spellEnd"/>
       <w:r>
         <w:rPr>
           <w:rFonts w:ascii="Consolas" w:hAnsi="Consolas" w:cs="Consolas"/>
@@ -3708,6 +3915,7 @@
         </w:rPr>
         <w:t>” to “</w:t>
       </w:r>
+      <w:proofErr w:type="spellStart"/>
       <w:r>
         <w:rPr>
           <w:rFonts w:ascii="Consolas" w:hAnsi="Consolas" w:cs="Consolas"/>
@@ -3717,6 +3925,7 @@
         </w:rPr>
         <w:t>ElevatorCarMoving</w:t>
       </w:r>
+      <w:proofErr w:type="spellEnd"/>
       <w:r>
         <w:rPr>
           <w:rFonts w:ascii="Consolas" w:hAnsi="Consolas" w:cs="Consolas"/>
@@ -3827,6 +4036,7 @@
         </w:rPr>
         <w:t>This effect must have an activity parameter node whose type is “</w:t>
       </w:r>
+      <w:proofErr w:type="spellStart"/>
       <w:r>
         <w:rPr>
           <w:rFonts w:ascii="Consolas" w:hAnsi="Consolas" w:cs="Consolas"/>
@@ -3836,6 +4046,7 @@
         </w:rPr>
         <w:t>MovementRequest</w:t>
       </w:r>
+      <w:proofErr w:type="spellEnd"/>
       <w:r>
         <w:rPr>
           <w:rFonts w:ascii="Consolas" w:hAnsi="Consolas" w:cs="Consolas"/>
@@ -3932,8 +4143,27 @@
           <w:szCs w:val="24"/>
           <w:lang w:val="en-US"/>
         </w:rPr>
-        <w:t xml:space="preserve"> The signal is emitted through the port “</w:t>
-      </w:r>
+        <w:t xml:space="preserve"> The signal </w:t>
+      </w:r>
+      <w:proofErr w:type="gramStart"/>
+      <w:r>
+        <w:rPr>
+          <w:rFonts w:ascii="Consolas" w:hAnsi="Consolas" w:cs="Consolas"/>
+          <w:szCs w:val="24"/>
+          <w:lang w:val="en-US"/>
+        </w:rPr>
+        <w:t>is emitted</w:t>
+      </w:r>
+      <w:proofErr w:type="gramEnd"/>
+      <w:r>
+        <w:rPr>
+          <w:rFonts w:ascii="Consolas" w:hAnsi="Consolas" w:cs="Consolas"/>
+          <w:szCs w:val="24"/>
+          <w:lang w:val="en-US"/>
+        </w:rPr>
+        <w:t xml:space="preserve"> through the port “</w:t>
+      </w:r>
+      <w:proofErr w:type="spellStart"/>
       <w:r>
         <w:rPr>
           <w:rFonts w:ascii="Consolas" w:hAnsi="Consolas" w:cs="Consolas"/>
@@ -3943,6 +4173,7 @@
         </w:rPr>
         <w:t>pE</w:t>
       </w:r>
+      <w:proofErr w:type="spellEnd"/>
       <w:r>
         <w:rPr>
           <w:rFonts w:ascii="Consolas" w:hAnsi="Consolas" w:cs="Consolas"/>
@@ -4001,8 +4232,27 @@
           <w:szCs w:val="24"/>
           <w:lang w:val="en-US"/>
         </w:rPr>
-        <w:t>resolution of B requires that you add a new signal in your model. In addition the contract on the port “</w:t>
-      </w:r>
+        <w:t xml:space="preserve">resolution of B requires that you add a new signal in your model. In </w:t>
+      </w:r>
+      <w:proofErr w:type="gramStart"/>
+      <w:r>
+        <w:rPr>
+          <w:rFonts w:ascii="Consolas" w:hAnsi="Consolas" w:cs="Consolas"/>
+          <w:szCs w:val="24"/>
+          <w:lang w:val="en-US"/>
+        </w:rPr>
+        <w:t>addition</w:t>
+      </w:r>
+      <w:proofErr w:type="gramEnd"/>
+      <w:r>
+        <w:rPr>
+          <w:rFonts w:ascii="Consolas" w:hAnsi="Consolas" w:cs="Consolas"/>
+          <w:szCs w:val="24"/>
+          <w:lang w:val="en-US"/>
+        </w:rPr>
+        <w:t xml:space="preserve"> the contract on the port “</w:t>
+      </w:r>
+      <w:proofErr w:type="spellStart"/>
       <w:r>
         <w:rPr>
           <w:rFonts w:ascii="Consolas" w:hAnsi="Consolas" w:cs="Consolas"/>
@@ -4012,6 +4262,7 @@
         </w:rPr>
         <w:t>pE</w:t>
       </w:r>
+      <w:proofErr w:type="spellEnd"/>
       <w:r>
         <w:rPr>
           <w:rFonts w:ascii="Consolas" w:hAnsi="Consolas" w:cs="Consolas"/>
@@ -4073,7 +4324,6 @@
                                 <w:lang w:val="en-US"/>
                               </w:rPr>
                             </w:pPr>
-                            <w:bookmarkStart w:id="0" w:name="_GoBack"/>
                             <w:r>
                               <w:rPr>
                                 <w:rFonts w:ascii="Arial" w:hAnsi="Arial" w:cs="Arial"/>
@@ -4107,7 +4357,6 @@
                               </w:rPr>
                               <w:t>Redistribution and use (commercial or non-commercial), of this presentation, with or without modification, is strictly forbidden without explicit and official approval from CEA LIST</w:t>
                             </w:r>
-                            <w:bookmarkEnd w:id="0"/>
                           </w:p>
                         </w:txbxContent>
                       </wps:txbx>
@@ -4199,7 +4448,7 @@
 </file>
 
 <file path=word/endnotes.xml><?xml version="1.0" encoding="utf-8"?>
-<w:endnotes xmlns:wpc="http://schemas.microsoft.com/office/word/2010/wordprocessingCanvas" xmlns:mc="http://schemas.openxmlformats.org/markup-compatibility/2006" xmlns:o="urn:schemas-microsoft-com:office:office" xmlns:r="http://schemas.openxmlformats.org/officeDocument/2006/relationships" xmlns:m="http://schemas.openxmlformats.org/officeDocument/2006/math" xmlns:v="urn:schemas-microsoft-com:vml" xmlns:wp14="http://schemas.microsoft.com/office/word/2010/wordprocessingDrawing" xmlns:wp="http://schemas.openxmlformats.org/drawingml/2006/wordprocessingDrawing" xmlns:w10="urn:schemas-microsoft-com:office:word" xmlns:w="http://schemas.openxmlformats.org/wordprocessingml/2006/main" xmlns:w14="http://schemas.microsoft.com/office/word/2010/wordml" xmlns:w15="http://schemas.microsoft.com/office/word/2012/wordml" xmlns:wpg="http://schemas.microsoft.com/office/word/2010/wordprocessingGroup" xmlns:wpi="http://schemas.microsoft.com/office/word/2010/wordprocessingInk" xmlns:wne="http://schemas.microsoft.com/office/word/2006/wordml" xmlns:wps="http://schemas.microsoft.com/office/word/2010/wordprocessingShape" mc:Ignorable="w14 w15 wp14">
+<w:endnotes xmlns:wpc="http://schemas.microsoft.com/office/word/2010/wordprocessingCanvas" xmlns:cx="http://schemas.microsoft.com/office/drawing/2014/chartex" xmlns:cx1="http://schemas.microsoft.com/office/drawing/2015/9/8/chartex" xmlns:mc="http://schemas.openxmlformats.org/markup-compatibility/2006" xmlns:o="urn:schemas-microsoft-com:office:office" xmlns:r="http://schemas.openxmlformats.org/officeDocument/2006/relationships" xmlns:m="http://schemas.openxmlformats.org/officeDocument/2006/math" xmlns:v="urn:schemas-microsoft-com:vml" xmlns:wp14="http://schemas.microsoft.com/office/word/2010/wordprocessingDrawing" xmlns:wp="http://schemas.openxmlformats.org/drawingml/2006/wordprocessingDrawing" xmlns:w10="urn:schemas-microsoft-com:office:word" xmlns:w="http://schemas.openxmlformats.org/wordprocessingml/2006/main" xmlns:w14="http://schemas.microsoft.com/office/word/2010/wordml" xmlns:w15="http://schemas.microsoft.com/office/word/2012/wordml" xmlns:w16se="http://schemas.microsoft.com/office/word/2015/wordml/symex" xmlns:wpg="http://schemas.microsoft.com/office/word/2010/wordprocessingGroup" xmlns:wpi="http://schemas.microsoft.com/office/word/2010/wordprocessingInk" xmlns:wne="http://schemas.microsoft.com/office/word/2006/wordml" xmlns:wps="http://schemas.microsoft.com/office/word/2010/wordprocessingShape" mc:Ignorable="w14 w15 w16se wp14">
   <w:endnote w:type="separator" w:id="-1">
     <w:p>
       <w:pPr>
@@ -4224,7 +4473,7 @@
 </file>
 
 <file path=word/footer1.xml><?xml version="1.0" encoding="utf-8"?>
-<w:ftr xmlns:wpc="http://schemas.microsoft.com/office/word/2010/wordprocessingCanvas" xmlns:mc="http://schemas.openxmlformats.org/markup-compatibility/2006" xmlns:o="urn:schemas-microsoft-com:office:office" xmlns:r="http://schemas.openxmlformats.org/officeDocument/2006/relationships" xmlns:m="http://schemas.openxmlformats.org/officeDocument/2006/math" xmlns:v="urn:schemas-microsoft-com:vml" xmlns:wp14="http://schemas.microsoft.com/office/word/2010/wordprocessingDrawing" xmlns:wp="http://schemas.openxmlformats.org/drawingml/2006/wordprocessingDrawing" xmlns:w10="urn:schemas-microsoft-com:office:word" xmlns:w="http://schemas.openxmlformats.org/wordprocessingml/2006/main" xmlns:w14="http://schemas.microsoft.com/office/word/2010/wordml" xmlns:w15="http://schemas.microsoft.com/office/word/2012/wordml" xmlns:wpg="http://schemas.microsoft.com/office/word/2010/wordprocessingGroup" xmlns:wpi="http://schemas.microsoft.com/office/word/2010/wordprocessingInk" xmlns:wne="http://schemas.microsoft.com/office/word/2006/wordml" xmlns:wps="http://schemas.microsoft.com/office/word/2010/wordprocessingShape" mc:Ignorable="w14 w15 wp14">
+<w:ftr xmlns:wpc="http://schemas.microsoft.com/office/word/2010/wordprocessingCanvas" xmlns:cx="http://schemas.microsoft.com/office/drawing/2014/chartex" xmlns:cx1="http://schemas.microsoft.com/office/drawing/2015/9/8/chartex" xmlns:mc="http://schemas.openxmlformats.org/markup-compatibility/2006" xmlns:o="urn:schemas-microsoft-com:office:office" xmlns:r="http://schemas.openxmlformats.org/officeDocument/2006/relationships" xmlns:m="http://schemas.openxmlformats.org/officeDocument/2006/math" xmlns:v="urn:schemas-microsoft-com:vml" xmlns:wp14="http://schemas.microsoft.com/office/word/2010/wordprocessingDrawing" xmlns:wp="http://schemas.openxmlformats.org/drawingml/2006/wordprocessingDrawing" xmlns:w10="urn:schemas-microsoft-com:office:word" xmlns:w="http://schemas.openxmlformats.org/wordprocessingml/2006/main" xmlns:w14="http://schemas.microsoft.com/office/word/2010/wordml" xmlns:w15="http://schemas.microsoft.com/office/word/2012/wordml" xmlns:w16se="http://schemas.microsoft.com/office/word/2015/wordml/symex" xmlns:wpg="http://schemas.microsoft.com/office/word/2010/wordprocessingGroup" xmlns:wpi="http://schemas.microsoft.com/office/word/2010/wordprocessingInk" xmlns:wne="http://schemas.microsoft.com/office/word/2006/wordml" xmlns:wps="http://schemas.microsoft.com/office/word/2010/wordprocessingShape" mc:Ignorable="w14 w15 w16se wp14">
   <w:p>
     <w:pPr>
       <w:pStyle w:val="Pieddepage"/>
@@ -4243,7 +4492,7 @@
       <w:rPr>
         <w:noProof/>
       </w:rPr>
-      <w:t>4</w:t>
+      <w:t>2</w:t>
     </w:r>
     <w:r>
       <w:fldChar w:fldCharType="end"/>
@@ -4253,7 +4502,7 @@
 </file>
 
 <file path=word/footnotes.xml><?xml version="1.0" encoding="utf-8"?>
-<w:footnotes xmlns:wpc="http://schemas.microsoft.com/office/word/2010/wordprocessingCanvas" xmlns:mc="http://schemas.openxmlformats.org/markup-compatibility/2006" xmlns:o="urn:schemas-microsoft-com:office:office" xmlns:r="http://schemas.openxmlformats.org/officeDocument/2006/relationships" xmlns:m="http://schemas.openxmlformats.org/officeDocument/2006/math" xmlns:v="urn:schemas-microsoft-com:vml" xmlns:wp14="http://schemas.microsoft.com/office/word/2010/wordprocessingDrawing" xmlns:wp="http://schemas.openxmlformats.org/drawingml/2006/wordprocessingDrawing" xmlns:w10="urn:schemas-microsoft-com:office:word" xmlns:w="http://schemas.openxmlformats.org/wordprocessingml/2006/main" xmlns:w14="http://schemas.microsoft.com/office/word/2010/wordml" xmlns:w15="http://schemas.microsoft.com/office/word/2012/wordml" xmlns:wpg="http://schemas.microsoft.com/office/word/2010/wordprocessingGroup" xmlns:wpi="http://schemas.microsoft.com/office/word/2010/wordprocessingInk" xmlns:wne="http://schemas.microsoft.com/office/word/2006/wordml" xmlns:wps="http://schemas.microsoft.com/office/word/2010/wordprocessingShape" mc:Ignorable="w14 w15 wp14">
+<w:footnotes xmlns:wpc="http://schemas.microsoft.com/office/word/2010/wordprocessingCanvas" xmlns:cx="http://schemas.microsoft.com/office/drawing/2014/chartex" xmlns:cx1="http://schemas.microsoft.com/office/drawing/2015/9/8/chartex" xmlns:mc="http://schemas.openxmlformats.org/markup-compatibility/2006" xmlns:o="urn:schemas-microsoft-com:office:office" xmlns:r="http://schemas.openxmlformats.org/officeDocument/2006/relationships" xmlns:m="http://schemas.openxmlformats.org/officeDocument/2006/math" xmlns:v="urn:schemas-microsoft-com:vml" xmlns:wp14="http://schemas.microsoft.com/office/word/2010/wordprocessingDrawing" xmlns:wp="http://schemas.openxmlformats.org/drawingml/2006/wordprocessingDrawing" xmlns:w10="urn:schemas-microsoft-com:office:word" xmlns:w="http://schemas.openxmlformats.org/wordprocessingml/2006/main" xmlns:w14="http://schemas.microsoft.com/office/word/2010/wordml" xmlns:w15="http://schemas.microsoft.com/office/word/2012/wordml" xmlns:w16se="http://schemas.microsoft.com/office/word/2015/wordml/symex" xmlns:wpg="http://schemas.microsoft.com/office/word/2010/wordprocessingGroup" xmlns:wpi="http://schemas.microsoft.com/office/word/2010/wordprocessingInk" xmlns:wne="http://schemas.microsoft.com/office/word/2006/wordml" xmlns:wps="http://schemas.microsoft.com/office/word/2010/wordprocessingShape" mc:Ignorable="w14 w15 w16se wp14">
   <w:footnote w:type="separator" w:id="-1">
     <w:p>
       <w:pPr>
@@ -4278,7 +4527,7 @@
 </file>
 
 <file path=word/header1.xml><?xml version="1.0" encoding="utf-8"?>
-<w:hdr xmlns:wpc="http://schemas.microsoft.com/office/word/2010/wordprocessingCanvas" xmlns:mc="http://schemas.openxmlformats.org/markup-compatibility/2006" xmlns:o="urn:schemas-microsoft-com:office:office" xmlns:r="http://schemas.openxmlformats.org/officeDocument/2006/relationships" xmlns:m="http://schemas.openxmlformats.org/officeDocument/2006/math" xmlns:v="urn:schemas-microsoft-com:vml" xmlns:wp14="http://schemas.microsoft.com/office/word/2010/wordprocessingDrawing" xmlns:wp="http://schemas.openxmlformats.org/drawingml/2006/wordprocessingDrawing" xmlns:w10="urn:schemas-microsoft-com:office:word" xmlns:w="http://schemas.openxmlformats.org/wordprocessingml/2006/main" xmlns:w14="http://schemas.microsoft.com/office/word/2010/wordml" xmlns:w15="http://schemas.microsoft.com/office/word/2012/wordml" xmlns:wpg="http://schemas.microsoft.com/office/word/2010/wordprocessingGroup" xmlns:wpi="http://schemas.microsoft.com/office/word/2010/wordprocessingInk" xmlns:wne="http://schemas.microsoft.com/office/word/2006/wordml" xmlns:wps="http://schemas.microsoft.com/office/word/2010/wordprocessingShape" mc:Ignorable="w14 w15 wp14">
+<w:hdr xmlns:wpc="http://schemas.microsoft.com/office/word/2010/wordprocessingCanvas" xmlns:cx="http://schemas.microsoft.com/office/drawing/2014/chartex" xmlns:cx1="http://schemas.microsoft.com/office/drawing/2015/9/8/chartex" xmlns:mc="http://schemas.openxmlformats.org/markup-compatibility/2006" xmlns:o="urn:schemas-microsoft-com:office:office" xmlns:r="http://schemas.openxmlformats.org/officeDocument/2006/relationships" xmlns:m="http://schemas.openxmlformats.org/officeDocument/2006/math" xmlns:v="urn:schemas-microsoft-com:vml" xmlns:wp14="http://schemas.microsoft.com/office/word/2010/wordprocessingDrawing" xmlns:wp="http://schemas.openxmlformats.org/drawingml/2006/wordprocessingDrawing" xmlns:w10="urn:schemas-microsoft-com:office:word" xmlns:w="http://schemas.openxmlformats.org/wordprocessingml/2006/main" xmlns:w14="http://schemas.microsoft.com/office/word/2010/wordml" xmlns:w15="http://schemas.microsoft.com/office/word/2012/wordml" xmlns:w16se="http://schemas.microsoft.com/office/word/2015/wordml/symex" xmlns:wpg="http://schemas.microsoft.com/office/word/2010/wordprocessingGroup" xmlns:wpi="http://schemas.microsoft.com/office/word/2010/wordprocessingInk" xmlns:wne="http://schemas.microsoft.com/office/word/2006/wordml" xmlns:wps="http://schemas.microsoft.com/office/word/2010/wordprocessingShape" mc:Ignorable="w14 w15 w16se wp14">
   <w:tbl>
     <w:tblPr>
       <w:tblStyle w:val="Grilledutableau"/>
@@ -4436,7 +4685,7 @@
 </file>
 
 <file path=word/numbering.xml><?xml version="1.0" encoding="utf-8"?>
-<w:numbering xmlns:wpc="http://schemas.microsoft.com/office/word/2010/wordprocessingCanvas" xmlns:mc="http://schemas.openxmlformats.org/markup-compatibility/2006" xmlns:o="urn:schemas-microsoft-com:office:office" xmlns:r="http://schemas.openxmlformats.org/officeDocument/2006/relationships" xmlns:m="http://schemas.openxmlformats.org/officeDocument/2006/math" xmlns:v="urn:schemas-microsoft-com:vml" xmlns:wp14="http://schemas.microsoft.com/office/word/2010/wordprocessingDrawing" xmlns:wp="http://schemas.openxmlformats.org/drawingml/2006/wordprocessingDrawing" xmlns:w10="urn:schemas-microsoft-com:office:word" xmlns:w="http://schemas.openxmlformats.org/wordprocessingml/2006/main" xmlns:w14="http://schemas.microsoft.com/office/word/2010/wordml" xmlns:w15="http://schemas.microsoft.com/office/word/2012/wordml" xmlns:wpg="http://schemas.microsoft.com/office/word/2010/wordprocessingGroup" xmlns:wpi="http://schemas.microsoft.com/office/word/2010/wordprocessingInk" xmlns:wne="http://schemas.microsoft.com/office/word/2006/wordml" xmlns:wps="http://schemas.microsoft.com/office/word/2010/wordprocessingShape" mc:Ignorable="w14 w15 wp14">
+<w:numbering xmlns:wpc="http://schemas.microsoft.com/office/word/2010/wordprocessingCanvas" xmlns:cx="http://schemas.microsoft.com/office/drawing/2014/chartex" xmlns:cx1="http://schemas.microsoft.com/office/drawing/2015/9/8/chartex" xmlns:mc="http://schemas.openxmlformats.org/markup-compatibility/2006" xmlns:o="urn:schemas-microsoft-com:office:office" xmlns:r="http://schemas.openxmlformats.org/officeDocument/2006/relationships" xmlns:m="http://schemas.openxmlformats.org/officeDocument/2006/math" xmlns:v="urn:schemas-microsoft-com:vml" xmlns:wp14="http://schemas.microsoft.com/office/word/2010/wordprocessingDrawing" xmlns:wp="http://schemas.openxmlformats.org/drawingml/2006/wordprocessingDrawing" xmlns:w10="urn:schemas-microsoft-com:office:word" xmlns:w="http://schemas.openxmlformats.org/wordprocessingml/2006/main" xmlns:w14="http://schemas.microsoft.com/office/word/2010/wordml" xmlns:w15="http://schemas.microsoft.com/office/word/2012/wordml" xmlns:w16se="http://schemas.microsoft.com/office/word/2015/wordml/symex" xmlns:wpg="http://schemas.microsoft.com/office/word/2010/wordprocessingGroup" xmlns:wpi="http://schemas.microsoft.com/office/word/2010/wordprocessingInk" xmlns:wne="http://schemas.microsoft.com/office/word/2006/wordml" xmlns:wps="http://schemas.microsoft.com/office/word/2010/wordprocessingShape" mc:Ignorable="w14 w15 w16se wp14">
   <w:abstractNum w:abstractNumId="0" w15:restartNumberingAfterBreak="0">
     <w:nsid w:val="07A90515"/>
     <w:multiLevelType w:val="hybridMultilevel"/>
@@ -6028,7 +6277,7 @@
 </file>
 
 <file path=word/styles.xml><?xml version="1.0" encoding="utf-8"?>
-<w:styles xmlns:mc="http://schemas.openxmlformats.org/markup-compatibility/2006" xmlns:r="http://schemas.openxmlformats.org/officeDocument/2006/relationships" xmlns:w="http://schemas.openxmlformats.org/wordprocessingml/2006/main" xmlns:w14="http://schemas.microsoft.com/office/word/2010/wordml" xmlns:w15="http://schemas.microsoft.com/office/word/2012/wordml" mc:Ignorable="w14 w15">
+<w:styles xmlns:mc="http://schemas.openxmlformats.org/markup-compatibility/2006" xmlns:r="http://schemas.openxmlformats.org/officeDocument/2006/relationships" xmlns:w="http://schemas.openxmlformats.org/wordprocessingml/2006/main" xmlns:w14="http://schemas.microsoft.com/office/word/2010/wordml" xmlns:w15="http://schemas.microsoft.com/office/word/2012/wordml" xmlns:w16se="http://schemas.microsoft.com/office/word/2015/wordml/symex" mc:Ignorable="w14 w15 w16se">
   <w:docDefaults>
     <w:rPrDefault>
       <w:rPr>
@@ -6819,7 +7068,7 @@
 </file>
 
 <file path=customXml/itemProps1.xml><?xml version="1.0" encoding="utf-8"?>
-<ds:datastoreItem xmlns:ds="http://schemas.openxmlformats.org/officeDocument/2006/customXml" ds:itemID="{868EFF25-6F73-4862-8B96-34696210879E}">
+<ds:datastoreItem xmlns:ds="http://schemas.openxmlformats.org/officeDocument/2006/customXml" ds:itemID="{0666F64B-E64D-4735-9285-75D8ADF4521F}">
   <ds:schemaRefs>
     <ds:schemaRef ds:uri="http://schemas.openxmlformats.org/officeDocument/2006/bibliography"/>
   </ds:schemaRefs>

</xml_diff>